<commit_message>
feat: ingreso rapido masivo de notas, examenes y asistencia para los formatos AL
- Tablas RegistroNotaGlobal, RegistroExamenGlobal y RegistroAsistenciaGlobal
- Endpoints /api/configuracion/{notas,examenes,asistencias}-bulk (solo ADMIN)
- AL14, AL15, AL16, AL18, AL19, AL22 y AL23 usan el valor rapido con prioridad
- Seccion "Ingreso rapido" en Configuracion con tablas tipo hoja de calculo,
  copia del primer al segundo semestre y atajo "aplicar a todos"
- Ajustes en las plantillas AL12 y AL13

Co-Authored-By: Claude Opus 5.5 <noreply@anthropic.com>
</commit_message>
<xml_diff>
--- a/backend/templates/AL13CERTIFICADODEMATRICULA.docx
+++ b/backend/templates/AL13CERTIFICADODEMATRICULA.docx
@@ -2998,7 +2998,6 @@
       <w:r>
         <w:t>AF2</w:t>
       </w:r>
-      <w:proofErr w:type="gramStart"/>
       <w:r>
         <w:t>}</w:t>
       </w:r>
@@ -3021,50 +3020,41 @@
           <w:sz w:val="22"/>
           <w:szCs w:val="22"/>
         </w:rPr>
-        <w:t>Rama</w:t>
-      </w:r>
-      <w:proofErr w:type="gramEnd"/>
+        <w:t>Rama Artesanal:</w:t>
+      </w:r>
+      <w:r>
+        <w:t xml:space="preserve"> </w:t>
+      </w:r>
       <w:r>
         <w:rPr>
           <w:sz w:val="22"/>
           <w:szCs w:val="22"/>
         </w:rPr>
-        <w:t xml:space="preserve"> Artesanal:</w:t>
-      </w:r>
-      <w:r>
-        <w:t xml:space="preserve"> </w:t>
-      </w:r>
+        <w:t>{</w:t>
+      </w:r>
+      <w:proofErr w:type="spellStart"/>
       <w:r>
         <w:rPr>
           <w:sz w:val="22"/>
           <w:szCs w:val="22"/>
         </w:rPr>
-        <w:t>{</w:t>
-      </w:r>
-      <w:proofErr w:type="spellStart"/>
+        <w:t>raArt</w:t>
+      </w:r>
+      <w:proofErr w:type="spellEnd"/>
       <w:r>
         <w:rPr>
           <w:sz w:val="22"/>
           <w:szCs w:val="22"/>
         </w:rPr>
-        <w:t>raArt</w:t>
-      </w:r>
-      <w:proofErr w:type="spellEnd"/>
+        <w:t>}</w:t>
+      </w:r>
       <w:r>
         <w:rPr>
           <w:sz w:val="22"/>
           <w:szCs w:val="22"/>
         </w:rPr>
-        <w:t>}</w:t>
-      </w:r>
-    </w:p>
-    <w:p>
-      <w:pPr>
-        <w:rPr>
-          <w:sz w:val="22"/>
-          <w:szCs w:val="22"/>
-        </w:rPr>
-      </w:pPr>
+        <w:t xml:space="preserve"> </w:t>
+      </w:r>
       <w:r>
         <w:rPr>
           <w:sz w:val="22"/>

</xml_diff>